<commit_message>
review: include Customer Address / Contact Company / Miles from HQ; drop no-op path replace
Reviewer found 4 service-map fields with no placeholder in the new
template (Bid Amount, Customer Address, Customer Contact Company,
Miles from HQ). Added the latter three to the template:
  - Customer Address line in the TO block
  - Customer Contact Company appended to the contact-name line
  - Miles from HQ line in the PROJECT block

Bid Amount intentionally NOT added — it's an alias of Grand Total
(same computed value, see BidDocumentService.js:258 + :266). The
service keeps both keys for back-compat with custom PM templates;
our default uses Grand Total only.

Also dropped the no-op `replace(/^templates\//, 'templates/')` regex
in the migration — flagged by reviewer as redundant.

Re-ran the generator: template now exposes 25 placeholders.

Co-Authored-By: Claude Opus 4.7 (1M context) <noreply@anthropic.com>
</commit_message>
<xml_diff>
--- a/project/templates/defaults/bid_template_default.docx
+++ b/project/templates/defaults/bid_template_default.docx
@@ -102,8 +102,25 @@
               <w:rPr>
                 <w:color w:val="1F2937"/>
               </w:rPr>
+              <w:t xml:space="preserve">{Customer Address}</w:t>
+            </w:r>
+          </w:p>
+          <w:p>
+            <w:r>
+              <w:rPr>
+                <w:color w:val="1F2937"/>
+              </w:rPr>
               <w:t xml:space="preserve">{Customer Contact Name}</w:t>
             </w:r>
+            <w:r>
+              <w:t xml:space="preserve"> — </w:t>
+            </w:r>
+            <w:r>
+              <w:rPr>
+                <w:color w:val="1F2937"/>
+              </w:rPr>
+              <w:t xml:space="preserve">{Customer Contact Company}</w:t>
+            </w:r>
           </w:p>
           <w:p>
             <w:r>
@@ -166,6 +183,22 @@
                 <w:color w:val="1F2937"/>
               </w:rPr>
               <w:t xml:space="preserve">{Local Union}</w:t>
+            </w:r>
+          </w:p>
+          <w:p>
+            <w:r>
+              <w:rPr>
+                <w:b/>
+                <w:bCs/>
+                <w:color w:val="64748B"/>
+              </w:rPr>
+              <w:t xml:space="preserve">Miles from HQ: </w:t>
+            </w:r>
+            <w:r>
+              <w:rPr>
+                <w:color w:val="1F2937"/>
+              </w:rPr>
+              <w:t xml:space="preserve">{Miles from HQ}</w:t>
             </w:r>
           </w:p>
         </w:tc>

</xml_diff>